<commit_message>
Add MR3 foreign-exchange risk to macro risks, mitigated by stated hedging
Adds MR3 to the risk matrix (medium likelihood, medium impact) and to the Spanish and English risk
pages, links it from the macro appendix, and trims text so each page still fits on one sheet.

Co-Authored-By: Claude Sonnet 5.5 <noreply@anthropic.com>
Claude-Session: https://claude.ai/code/session_0188QZHBkA8n5QL7BtmFakQg
</commit_message>
<xml_diff>
--- a/informe/Mallplaza_Anexo_Macro_EN.docx
+++ b/informe/Mallplaza_Anexo_Macro_EN.docx
@@ -2313,7 +2313,7 @@
                 <w:sz w:val="13"/>
                 <w:szCs w:val="13"/>
               </w:rPr>
-              <w:t xml:space="preserve">1.41% weighted CRP in Ke</w:t>
+              <w:t xml:space="preserve">1.41% weighted CRP in Ke; currency hedging stated by the company</w:t>
             </w:r>
           </w:p>
         </w:tc>
@@ -2349,7 +2349,7 @@
                 <w:sz w:val="13"/>
                 <w:szCs w:val="13"/>
               </w:rPr>
-              <w:t xml:space="preserve">FR1</w:t>
+              <w:t xml:space="preserve">FR1 · MR3</w:t>
             </w:r>
           </w:p>
         </w:tc>

</xml_diff>

<commit_message>
Update sensitivity heatmap and operational tornado to the consolidated v2 model
v2 discounts each period with its own WACC. Heatmap: target price 5x5 (terminal WACC +-1 pp in
parallel vs g 2.0-4.0%, base CLP 2,076 at the centre), verified against the workbook's Sensibilidad
sheet. Tornado reproduces the v2 DCF (CLP 1,857) before flexing the seven drivers, footfall included.
Risk page and macro appendix text updated to the new figures.

Co-Authored-By: Claude Sonnet 5.5 <noreply@anthropic.com>
Claude-Session: https://claude.ai/code/session_0188QZHBkA8n5QL7BtmFakQg
</commit_message>
<xml_diff>
--- a/informe/Mallplaza_Anexo_Macro_EN.docx
+++ b/informe/Mallplaza_Anexo_Macro_EN.docx
@@ -1949,7 +1949,7 @@
                 <w:sz w:val="13"/>
                 <w:szCs w:val="13"/>
               </w:rPr>
-              <w:t xml:space="preserve">Rf 4.98%; WACC +100 bp = target price −12.4% (Fig. 25)</w:t>
+              <w:t xml:space="preserve">Rf 4.98%; WACC +100 bp = target price −12.3% (Fig. 25)</w:t>
             </w:r>
           </w:p>
         </w:tc>
@@ -2662,7 +2662,7 @@
                 <w:sz w:val="13"/>
                 <w:szCs w:val="13"/>
               </w:rPr>
-              <w:t xml:space="preserve">≈ WACC +50 bp: target price from CLP 2,095 to ~1,957 (Fig. 25)</w:t>
+              <w:t xml:space="preserve">≈ WACC +50 bp: target price from CLP 2,076 to ~1,940 (Fig. 25)</w:t>
             </w:r>
           </w:p>
         </w:tc>
@@ -3280,7 +3280,7 @@
           <w:sz w:val="16"/>
           <w:szCs w:val="16"/>
         </w:rPr>
-        <w:t xml:space="preserve"> The backdrop raises the likelihood of the report's two most severe risks (FR1 and MR1). The model uses a 4.98% Rf and a 10.37% nominal WACC; with the 10Y UST above 5.2% in October, the bias on the discount rate is upward, which reinforces the recommendation.</w:t>
+        <w:t xml:space="preserve"> The backdrop raises the likelihood of the report's two most severe risks (FR1 and MR1). The model uses a 4.98% Rf and a 10.41% terminal nominal WACC (10.54% in 2H26E); with the 10Y UST above 5.2% in October, the bias on the discount rate is upward, which reinforces the recommendation.</w:t>
       </w:r>
     </w:p>
     <w:sectPr>

</xml_diff>

<commit_message>
Set single line spacing as document default and on image paragraphs so Word matches the LibreOffice layout
Co-Authored-By: Claude Opus 5.5 <noreply@anthropic.com>
Claude-Session: https://claude.ai/code/session_0188QZHBkA8n5QL7BtmFakQg
</commit_message>
<xml_diff>
--- a/informe/Mallplaza_Anexo_Macro_EN.docx
+++ b/informe/Mallplaza_Anexo_Macro_EN.docx
@@ -477,7 +477,7 @@
     </w:p>
     <w:p>
       <w:pPr>
-        <w:spacing w:after="20" w:before="0"/>
+        <w:spacing w:after="20" w:before="0" w:line="240" w:lineRule="auto"/>
       </w:pPr>
       <w:r>
         <w:drawing>
@@ -615,7 +615,7 @@
           </w:p>
           <w:p>
             <w:pPr>
-              <w:spacing w:after="20" w:before="0"/>
+              <w:spacing w:after="20" w:before="0" w:line="240" w:lineRule="auto"/>
             </w:pPr>
             <w:r>
               <w:drawing>
@@ -762,7 +762,7 @@
           </w:p>
           <w:p>
             <w:pPr>
-              <w:spacing w:after="20" w:before="0"/>
+              <w:spacing w:after="20" w:before="0" w:line="240" w:lineRule="auto"/>
             </w:pPr>
             <w:r>
               <w:drawing>
@@ -934,7 +934,7 @@
           </w:p>
           <w:p>
             <w:pPr>
-              <w:spacing w:after="20" w:before="0"/>
+              <w:spacing w:after="20" w:before="0" w:line="240" w:lineRule="auto"/>
             </w:pPr>
             <w:r>
               <w:drawing>
@@ -1081,7 +1081,7 @@
           </w:p>
           <w:p>
             <w:pPr>
-              <w:spacing w:after="20" w:before="0"/>
+              <w:spacing w:after="20" w:before="0" w:line="240" w:lineRule="auto"/>
             </w:pPr>
             <w:r>
               <w:drawing>
@@ -1248,7 +1248,7 @@
           </w:p>
           <w:p>
             <w:pPr>
-              <w:spacing w:after="20" w:before="0"/>
+              <w:spacing w:after="20" w:before="0" w:line="240" w:lineRule="auto"/>
             </w:pPr>
             <w:r>
               <w:drawing>
@@ -3531,7 +3531,11 @@
         <w:szCs w:val="15"/>
       </w:rPr>
     </w:rPrDefault>
-    <w:pPrDefault/>
+    <w:pPrDefault>
+      <w:pPr>
+        <w:spacing w:after="0" w:before="0" w:line="240" w:lineRule="auto"/>
+      </w:pPr>
+    </w:pPrDefault>
   </w:docDefaults>
   <w:style w:type="paragraph" w:styleId="Title">
     <w:name w:val="Title"/>

</xml_diff>